<commit_message>
Fin del ejercicio 4 y 5
</commit_message>
<xml_diff>
--- a/ejercicios/ud01_t01_psutil/UD01_T01 psutil.docx
+++ b/ejercicios/ud01_t01_psutil/UD01_T01 psutil.docx
@@ -280,7 +280,6 @@
       <w:pPr>
         <w:ind w:left="2880"/>
       </w:pPr>
-      <w:bookmarkStart w:id="0" w:name="_GoBack"/>
       <w:r>
         <w:rPr>
           <w:noProof/>
@@ -334,7 +333,652 @@
           </wp:inline>
         </w:drawing>
       </w:r>
+    </w:p>
+    <w:p>
+      <w:pPr>
+        <w:numPr>
+          <w:ilvl w:val="2"/>
+          <w:numId w:val="1"/>
+        </w:numPr>
+      </w:pPr>
+      <w:r>
+        <w:t>Información de memoria</w:t>
+      </w:r>
+    </w:p>
+    <w:p>
+      <w:pPr>
+        <w:numPr>
+          <w:ilvl w:val="3"/>
+          <w:numId w:val="1"/>
+        </w:numPr>
+      </w:pPr>
+      <w:r>
+        <w:t>Memoria total</w:t>
+      </w:r>
+    </w:p>
+    <w:p>
+      <w:pPr>
+        <w:ind w:left="2880"/>
+      </w:pPr>
+      <w:r>
+        <w:rPr>
+          <w:noProof/>
+        </w:rPr>
+        <w:drawing>
+          <wp:inline distT="0" distB="0" distL="0" distR="0" wp14:anchorId="244DF83E" wp14:editId="5E391A7E">
+            <wp:extent cx="2751455" cy="755650"/>
+            <wp:effectExtent l="0" t="0" r="0" b="6350"/>
+            <wp:docPr id="2" name="Imagen 2"/>
+            <wp:cNvGraphicFramePr>
+              <a:graphicFrameLocks xmlns:a="http://schemas.openxmlformats.org/drawingml/2006/main" noChangeAspect="1"/>
+            </wp:cNvGraphicFramePr>
+            <a:graphic xmlns:a="http://schemas.openxmlformats.org/drawingml/2006/main">
+              <a:graphicData uri="http://schemas.openxmlformats.org/drawingml/2006/picture">
+                <pic:pic xmlns:pic="http://schemas.openxmlformats.org/drawingml/2006/picture">
+                  <pic:nvPicPr>
+                    <pic:cNvPr id="0" name="Picture 1"/>
+                    <pic:cNvPicPr>
+                      <a:picLocks noChangeAspect="1" noChangeArrowheads="1"/>
+                    </pic:cNvPicPr>
+                  </pic:nvPicPr>
+                  <pic:blipFill>
+                    <a:blip r:embed="rId11">
+                      <a:extLst>
+                        <a:ext uri="{28A0092B-C50C-407E-A947-70E740481C1C}">
+                          <a14:useLocalDpi xmlns:a14="http://schemas.microsoft.com/office/drawing/2010/main" val="0"/>
+                        </a:ext>
+                      </a:extLst>
+                    </a:blip>
+                    <a:srcRect/>
+                    <a:stretch>
+                      <a:fillRect/>
+                    </a:stretch>
+                  </pic:blipFill>
+                  <pic:spPr bwMode="auto">
+                    <a:xfrm>
+                      <a:off x="0" y="0"/>
+                      <a:ext cx="2751455" cy="755650"/>
+                    </a:xfrm>
+                    <a:prstGeom prst="rect">
+                      <a:avLst/>
+                    </a:prstGeom>
+                    <a:noFill/>
+                    <a:ln>
+                      <a:noFill/>
+                    </a:ln>
+                  </pic:spPr>
+                </pic:pic>
+              </a:graphicData>
+            </a:graphic>
+          </wp:inline>
+        </w:drawing>
+      </w:r>
+    </w:p>
+    <w:p>
+      <w:pPr>
+        <w:numPr>
+          <w:ilvl w:val="3"/>
+          <w:numId w:val="1"/>
+        </w:numPr>
+      </w:pPr>
+      <w:r>
+        <w:t>Memoria disponible</w:t>
+      </w:r>
+    </w:p>
+    <w:p>
+      <w:pPr>
+        <w:ind w:left="2880"/>
+      </w:pPr>
+      <w:r>
+        <w:rPr>
+          <w:noProof/>
+        </w:rPr>
+        <w:drawing>
+          <wp:inline distT="0" distB="0" distL="0" distR="0" wp14:anchorId="54E5815E" wp14:editId="03A0E3EB">
+            <wp:extent cx="2989580" cy="381635"/>
+            <wp:effectExtent l="0" t="0" r="1270" b="0"/>
+            <wp:docPr id="5" name="Imagen 5"/>
+            <wp:cNvGraphicFramePr>
+              <a:graphicFrameLocks xmlns:a="http://schemas.openxmlformats.org/drawingml/2006/main" noChangeAspect="1"/>
+            </wp:cNvGraphicFramePr>
+            <a:graphic xmlns:a="http://schemas.openxmlformats.org/drawingml/2006/main">
+              <a:graphicData uri="http://schemas.openxmlformats.org/drawingml/2006/picture">
+                <pic:pic xmlns:pic="http://schemas.openxmlformats.org/drawingml/2006/picture">
+                  <pic:nvPicPr>
+                    <pic:cNvPr id="0" name="Picture 2"/>
+                    <pic:cNvPicPr>
+                      <a:picLocks noChangeAspect="1" noChangeArrowheads="1"/>
+                    </pic:cNvPicPr>
+                  </pic:nvPicPr>
+                  <pic:blipFill>
+                    <a:blip r:embed="rId12">
+                      <a:extLst>
+                        <a:ext uri="{28A0092B-C50C-407E-A947-70E740481C1C}">
+                          <a14:useLocalDpi xmlns:a14="http://schemas.microsoft.com/office/drawing/2010/main" val="0"/>
+                        </a:ext>
+                      </a:extLst>
+                    </a:blip>
+                    <a:srcRect/>
+                    <a:stretch>
+                      <a:fillRect/>
+                    </a:stretch>
+                  </pic:blipFill>
+                  <pic:spPr bwMode="auto">
+                    <a:xfrm>
+                      <a:off x="0" y="0"/>
+                      <a:ext cx="2989580" cy="381635"/>
+                    </a:xfrm>
+                    <a:prstGeom prst="rect">
+                      <a:avLst/>
+                    </a:prstGeom>
+                    <a:noFill/>
+                    <a:ln>
+                      <a:noFill/>
+                    </a:ln>
+                  </pic:spPr>
+                </pic:pic>
+              </a:graphicData>
+            </a:graphic>
+          </wp:inline>
+        </w:drawing>
+      </w:r>
+    </w:p>
+    <w:p>
+      <w:pPr>
+        <w:numPr>
+          <w:ilvl w:val="3"/>
+          <w:numId w:val="1"/>
+        </w:numPr>
+      </w:pPr>
+      <w:r>
+        <w:t>Porcentaje de memoria usada</w:t>
+      </w:r>
+    </w:p>
+    <w:p>
+      <w:pPr>
+        <w:ind w:left="2880"/>
+      </w:pPr>
+      <w:r>
+        <w:rPr>
+          <w:noProof/>
+        </w:rPr>
+        <w:drawing>
+          <wp:inline distT="0" distB="0" distL="0" distR="0">
+            <wp:extent cx="2870200" cy="413385"/>
+            <wp:effectExtent l="0" t="0" r="6350" b="5715"/>
+            <wp:docPr id="8" name="Imagen 8"/>
+            <wp:cNvGraphicFramePr>
+              <a:graphicFrameLocks xmlns:a="http://schemas.openxmlformats.org/drawingml/2006/main" noChangeAspect="1"/>
+            </wp:cNvGraphicFramePr>
+            <a:graphic xmlns:a="http://schemas.openxmlformats.org/drawingml/2006/main">
+              <a:graphicData uri="http://schemas.openxmlformats.org/drawingml/2006/picture">
+                <pic:pic xmlns:pic="http://schemas.openxmlformats.org/drawingml/2006/picture">
+                  <pic:nvPicPr>
+                    <pic:cNvPr id="0" name="Picture 3"/>
+                    <pic:cNvPicPr>
+                      <a:picLocks noChangeAspect="1" noChangeArrowheads="1"/>
+                    </pic:cNvPicPr>
+                  </pic:nvPicPr>
+                  <pic:blipFill>
+                    <a:blip r:embed="rId13">
+                      <a:extLst>
+                        <a:ext uri="{28A0092B-C50C-407E-A947-70E740481C1C}">
+                          <a14:useLocalDpi xmlns:a14="http://schemas.microsoft.com/office/drawing/2010/main" val="0"/>
+                        </a:ext>
+                      </a:extLst>
+                    </a:blip>
+                    <a:srcRect/>
+                    <a:stretch>
+                      <a:fillRect/>
+                    </a:stretch>
+                  </pic:blipFill>
+                  <pic:spPr bwMode="auto">
+                    <a:xfrm>
+                      <a:off x="0" y="0"/>
+                      <a:ext cx="2870200" cy="413385"/>
+                    </a:xfrm>
+                    <a:prstGeom prst="rect">
+                      <a:avLst/>
+                    </a:prstGeom>
+                    <a:noFill/>
+                    <a:ln>
+                      <a:noFill/>
+                    </a:ln>
+                  </pic:spPr>
+                </pic:pic>
+              </a:graphicData>
+            </a:graphic>
+          </wp:inline>
+        </w:drawing>
+      </w:r>
+    </w:p>
+    <w:p>
+      <w:pPr>
+        <w:numPr>
+          <w:ilvl w:val="2"/>
+          <w:numId w:val="1"/>
+        </w:numPr>
+      </w:pPr>
+      <w:r>
+        <w:t>Información de discos</w:t>
+      </w:r>
+    </w:p>
+    <w:p>
+      <w:pPr>
+        <w:numPr>
+          <w:ilvl w:val="3"/>
+          <w:numId w:val="1"/>
+        </w:numPr>
+      </w:pPr>
+      <w:r>
+        <w:t>Listado de particiones</w:t>
+      </w:r>
+    </w:p>
+    <w:p>
+      <w:pPr>
+        <w:ind w:left="2880"/>
+      </w:pPr>
+      <w:r>
+        <w:rPr>
+          <w:noProof/>
+        </w:rPr>
+        <w:drawing>
+          <wp:inline distT="0" distB="0" distL="0" distR="0">
+            <wp:extent cx="3552825" cy="819150"/>
+            <wp:effectExtent l="0" t="0" r="9525" b="0"/>
+            <wp:docPr id="9" name="Imagen 9"/>
+            <wp:cNvGraphicFramePr>
+              <a:graphicFrameLocks xmlns:a="http://schemas.openxmlformats.org/drawingml/2006/main" noChangeAspect="1"/>
+            </wp:cNvGraphicFramePr>
+            <a:graphic xmlns:a="http://schemas.openxmlformats.org/drawingml/2006/main">
+              <a:graphicData uri="http://schemas.openxmlformats.org/drawingml/2006/picture">
+                <pic:pic xmlns:pic="http://schemas.openxmlformats.org/drawingml/2006/picture">
+                  <pic:nvPicPr>
+                    <pic:cNvPr id="0" name="Picture 1"/>
+                    <pic:cNvPicPr>
+                      <a:picLocks noChangeAspect="1" noChangeArrowheads="1"/>
+                    </pic:cNvPicPr>
+                  </pic:nvPicPr>
+                  <pic:blipFill>
+                    <a:blip r:embed="rId14">
+                      <a:extLst>
+                        <a:ext uri="{28A0092B-C50C-407E-A947-70E740481C1C}">
+                          <a14:useLocalDpi xmlns:a14="http://schemas.microsoft.com/office/drawing/2010/main" val="0"/>
+                        </a:ext>
+                      </a:extLst>
+                    </a:blip>
+                    <a:srcRect/>
+                    <a:stretch>
+                      <a:fillRect/>
+                    </a:stretch>
+                  </pic:blipFill>
+                  <pic:spPr bwMode="auto">
+                    <a:xfrm>
+                      <a:off x="0" y="0"/>
+                      <a:ext cx="3552825" cy="819150"/>
+                    </a:xfrm>
+                    <a:prstGeom prst="rect">
+                      <a:avLst/>
+                    </a:prstGeom>
+                    <a:noFill/>
+                    <a:ln>
+                      <a:noFill/>
+                    </a:ln>
+                  </pic:spPr>
+                </pic:pic>
+              </a:graphicData>
+            </a:graphic>
+          </wp:inline>
+        </w:drawing>
+      </w:r>
+    </w:p>
+    <w:p>
+      <w:pPr>
+        <w:numPr>
+          <w:ilvl w:val="3"/>
+          <w:numId w:val="1"/>
+        </w:numPr>
+      </w:pPr>
+      <w:r>
+        <w:t>Uso de disco para cada unidad o partición</w:t>
+      </w:r>
+    </w:p>
+    <w:p>
+      <w:pPr>
+        <w:ind w:left="2880"/>
+      </w:pPr>
+      <w:r>
+        <w:rPr>
+          <w:noProof/>
+        </w:rPr>
+        <w:lastRenderedPageBreak/>
+        <w:drawing>
+          <wp:inline distT="0" distB="0" distL="0" distR="0">
+            <wp:extent cx="3771900" cy="409575"/>
+            <wp:effectExtent l="0" t="0" r="0" b="9525"/>
+            <wp:docPr id="10" name="Imagen 10"/>
+            <wp:cNvGraphicFramePr>
+              <a:graphicFrameLocks xmlns:a="http://schemas.openxmlformats.org/drawingml/2006/main" noChangeAspect="1"/>
+            </wp:cNvGraphicFramePr>
+            <a:graphic xmlns:a="http://schemas.openxmlformats.org/drawingml/2006/main">
+              <a:graphicData uri="http://schemas.openxmlformats.org/drawingml/2006/picture">
+                <pic:pic xmlns:pic="http://schemas.openxmlformats.org/drawingml/2006/picture">
+                  <pic:nvPicPr>
+                    <pic:cNvPr id="0" name="Picture 2"/>
+                    <pic:cNvPicPr>
+                      <a:picLocks noChangeAspect="1" noChangeArrowheads="1"/>
+                    </pic:cNvPicPr>
+                  </pic:nvPicPr>
+                  <pic:blipFill>
+                    <a:blip r:embed="rId15">
+                      <a:extLst>
+                        <a:ext uri="{28A0092B-C50C-407E-A947-70E740481C1C}">
+                          <a14:useLocalDpi xmlns:a14="http://schemas.microsoft.com/office/drawing/2010/main" val="0"/>
+                        </a:ext>
+                      </a:extLst>
+                    </a:blip>
+                    <a:srcRect/>
+                    <a:stretch>
+                      <a:fillRect/>
+                    </a:stretch>
+                  </pic:blipFill>
+                  <pic:spPr bwMode="auto">
+                    <a:xfrm>
+                      <a:off x="0" y="0"/>
+                      <a:ext cx="3771900" cy="409575"/>
+                    </a:xfrm>
+                    <a:prstGeom prst="rect">
+                      <a:avLst/>
+                    </a:prstGeom>
+                    <a:noFill/>
+                    <a:ln>
+                      <a:noFill/>
+                    </a:ln>
+                  </pic:spPr>
+                </pic:pic>
+              </a:graphicData>
+            </a:graphic>
+          </wp:inline>
+        </w:drawing>
+      </w:r>
+    </w:p>
+    <w:p>
+      <w:pPr>
+        <w:numPr>
+          <w:ilvl w:val="3"/>
+          <w:numId w:val="1"/>
+        </w:numPr>
+      </w:pPr>
+      <w:r>
+        <w:t>Número de operaciones de lectura</w:t>
+      </w:r>
+    </w:p>
+    <w:p>
+      <w:pPr>
+        <w:ind w:left="2880"/>
+      </w:pPr>
+      <w:r>
+        <w:rPr>
+          <w:noProof/>
+        </w:rPr>
+        <w:drawing>
+          <wp:inline distT="0" distB="0" distL="0" distR="0">
+            <wp:extent cx="3886200" cy="390525"/>
+            <wp:effectExtent l="0" t="0" r="0" b="9525"/>
+            <wp:docPr id="11" name="Imagen 11"/>
+            <wp:cNvGraphicFramePr>
+              <a:graphicFrameLocks xmlns:a="http://schemas.openxmlformats.org/drawingml/2006/main" noChangeAspect="1"/>
+            </wp:cNvGraphicFramePr>
+            <a:graphic xmlns:a="http://schemas.openxmlformats.org/drawingml/2006/main">
+              <a:graphicData uri="http://schemas.openxmlformats.org/drawingml/2006/picture">
+                <pic:pic xmlns:pic="http://schemas.openxmlformats.org/drawingml/2006/picture">
+                  <pic:nvPicPr>
+                    <pic:cNvPr id="0" name="Picture 3"/>
+                    <pic:cNvPicPr>
+                      <a:picLocks noChangeAspect="1" noChangeArrowheads="1"/>
+                    </pic:cNvPicPr>
+                  </pic:nvPicPr>
+                  <pic:blipFill>
+                    <a:blip r:embed="rId16">
+                      <a:extLst>
+                        <a:ext uri="{28A0092B-C50C-407E-A947-70E740481C1C}">
+                          <a14:useLocalDpi xmlns:a14="http://schemas.microsoft.com/office/drawing/2010/main" val="0"/>
+                        </a:ext>
+                      </a:extLst>
+                    </a:blip>
+                    <a:srcRect/>
+                    <a:stretch>
+                      <a:fillRect/>
+                    </a:stretch>
+                  </pic:blipFill>
+                  <pic:spPr bwMode="auto">
+                    <a:xfrm>
+                      <a:off x="0" y="0"/>
+                      <a:ext cx="3886200" cy="390525"/>
+                    </a:xfrm>
+                    <a:prstGeom prst="rect">
+                      <a:avLst/>
+                    </a:prstGeom>
+                    <a:noFill/>
+                    <a:ln>
+                      <a:noFill/>
+                    </a:ln>
+                  </pic:spPr>
+                </pic:pic>
+              </a:graphicData>
+            </a:graphic>
+          </wp:inline>
+        </w:drawing>
+      </w:r>
+    </w:p>
+    <w:p>
+      <w:pPr>
+        <w:numPr>
+          <w:ilvl w:val="3"/>
+          <w:numId w:val="1"/>
+        </w:numPr>
+      </w:pPr>
+      <w:r>
+        <w:t>Número de operaciones de escritura</w:t>
+      </w:r>
+    </w:p>
+    <w:p>
+      <w:pPr>
+        <w:ind w:left="2880"/>
+      </w:pPr>
+      <w:r>
+        <w:rPr>
+          <w:noProof/>
+        </w:rPr>
+        <w:drawing>
+          <wp:inline distT="0" distB="0" distL="0" distR="0">
+            <wp:extent cx="4002405" cy="405130"/>
+            <wp:effectExtent l="0" t="0" r="0" b="0"/>
+            <wp:docPr id="12" name="Imagen 12"/>
+            <wp:cNvGraphicFramePr>
+              <a:graphicFrameLocks xmlns:a="http://schemas.openxmlformats.org/drawingml/2006/main" noChangeAspect="1"/>
+            </wp:cNvGraphicFramePr>
+            <a:graphic xmlns:a="http://schemas.openxmlformats.org/drawingml/2006/main">
+              <a:graphicData uri="http://schemas.openxmlformats.org/drawingml/2006/picture">
+                <pic:pic xmlns:pic="http://schemas.openxmlformats.org/drawingml/2006/picture">
+                  <pic:nvPicPr>
+                    <pic:cNvPr id="0" name="Picture 4"/>
+                    <pic:cNvPicPr>
+                      <a:picLocks noChangeAspect="1" noChangeArrowheads="1"/>
+                    </pic:cNvPicPr>
+                  </pic:nvPicPr>
+                  <pic:blipFill>
+                    <a:blip r:embed="rId17">
+                      <a:extLst>
+                        <a:ext uri="{28A0092B-C50C-407E-A947-70E740481C1C}">
+                          <a14:useLocalDpi xmlns:a14="http://schemas.microsoft.com/office/drawing/2010/main" val="0"/>
+                        </a:ext>
+                      </a:extLst>
+                    </a:blip>
+                    <a:srcRect/>
+                    <a:stretch>
+                      <a:fillRect/>
+                    </a:stretch>
+                  </pic:blipFill>
+                  <pic:spPr bwMode="auto">
+                    <a:xfrm>
+                      <a:off x="0" y="0"/>
+                      <a:ext cx="4002405" cy="405130"/>
+                    </a:xfrm>
+                    <a:prstGeom prst="rect">
+                      <a:avLst/>
+                    </a:prstGeom>
+                    <a:noFill/>
+                    <a:ln>
+                      <a:noFill/>
+                    </a:ln>
+                  </pic:spPr>
+                </pic:pic>
+              </a:graphicData>
+            </a:graphic>
+          </wp:inline>
+        </w:drawing>
+      </w:r>
+    </w:p>
+    <w:p>
+      <w:pPr>
+        <w:numPr>
+          <w:ilvl w:val="3"/>
+          <w:numId w:val="1"/>
+        </w:numPr>
+      </w:pPr>
+      <w:r>
+        <w:t>Número de bytes leídos</w:t>
+      </w:r>
+    </w:p>
+    <w:p>
+      <w:pPr>
+        <w:ind w:left="2880"/>
+      </w:pPr>
+      <w:r>
+        <w:rPr>
+          <w:noProof/>
+        </w:rPr>
+        <w:drawing>
+          <wp:inline distT="0" distB="0" distL="0" distR="0">
+            <wp:extent cx="3898900" cy="405130"/>
+            <wp:effectExtent l="0" t="0" r="6350" b="0"/>
+            <wp:docPr id="13" name="Imagen 13"/>
+            <wp:cNvGraphicFramePr>
+              <a:graphicFrameLocks xmlns:a="http://schemas.openxmlformats.org/drawingml/2006/main" noChangeAspect="1"/>
+            </wp:cNvGraphicFramePr>
+            <a:graphic xmlns:a="http://schemas.openxmlformats.org/drawingml/2006/main">
+              <a:graphicData uri="http://schemas.openxmlformats.org/drawingml/2006/picture">
+                <pic:pic xmlns:pic="http://schemas.openxmlformats.org/drawingml/2006/picture">
+                  <pic:nvPicPr>
+                    <pic:cNvPr id="0" name="Picture 5"/>
+                    <pic:cNvPicPr>
+                      <a:picLocks noChangeAspect="1" noChangeArrowheads="1"/>
+                    </pic:cNvPicPr>
+                  </pic:nvPicPr>
+                  <pic:blipFill>
+                    <a:blip r:embed="rId18">
+                      <a:extLst>
+                        <a:ext uri="{28A0092B-C50C-407E-A947-70E740481C1C}">
+                          <a14:useLocalDpi xmlns:a14="http://schemas.microsoft.com/office/drawing/2010/main" val="0"/>
+                        </a:ext>
+                      </a:extLst>
+                    </a:blip>
+                    <a:srcRect/>
+                    <a:stretch>
+                      <a:fillRect/>
+                    </a:stretch>
+                  </pic:blipFill>
+                  <pic:spPr bwMode="auto">
+                    <a:xfrm>
+                      <a:off x="0" y="0"/>
+                      <a:ext cx="3898900" cy="405130"/>
+                    </a:xfrm>
+                    <a:prstGeom prst="rect">
+                      <a:avLst/>
+                    </a:prstGeom>
+                    <a:noFill/>
+                    <a:ln>
+                      <a:noFill/>
+                    </a:ln>
+                  </pic:spPr>
+                </pic:pic>
+              </a:graphicData>
+            </a:graphic>
+          </wp:inline>
+        </w:drawing>
+      </w:r>
+    </w:p>
+    <w:p>
+      <w:pPr>
+        <w:numPr>
+          <w:ilvl w:val="3"/>
+          <w:numId w:val="1"/>
+        </w:numPr>
+      </w:pPr>
+      <w:r>
+        <w:t>Número de bytes escritos</w:t>
+      </w:r>
+    </w:p>
+    <w:p>
+      <w:pPr>
+        <w:ind w:left="2880"/>
+      </w:pPr>
+      <w:bookmarkStart w:id="0" w:name="_GoBack"/>
       <w:bookmarkEnd w:id="0"/>
+      <w:r>
+        <w:rPr>
+          <w:noProof/>
+        </w:rPr>
+        <w:drawing>
+          <wp:inline distT="0" distB="0" distL="0" distR="0">
+            <wp:extent cx="4011295" cy="370840"/>
+            <wp:effectExtent l="0" t="0" r="8255" b="0"/>
+            <wp:docPr id="14" name="Imagen 14"/>
+            <wp:cNvGraphicFramePr>
+              <a:graphicFrameLocks xmlns:a="http://schemas.openxmlformats.org/drawingml/2006/main" noChangeAspect="1"/>
+            </wp:cNvGraphicFramePr>
+            <a:graphic xmlns:a="http://schemas.openxmlformats.org/drawingml/2006/main">
+              <a:graphicData uri="http://schemas.openxmlformats.org/drawingml/2006/picture">
+                <pic:pic xmlns:pic="http://schemas.openxmlformats.org/drawingml/2006/picture">
+                  <pic:nvPicPr>
+                    <pic:cNvPr id="0" name="Picture 6"/>
+                    <pic:cNvPicPr>
+                      <a:picLocks noChangeAspect="1" noChangeArrowheads="1"/>
+                    </pic:cNvPicPr>
+                  </pic:nvPicPr>
+                  <pic:blipFill>
+                    <a:blip r:embed="rId19">
+                      <a:extLst>
+                        <a:ext uri="{28A0092B-C50C-407E-A947-70E740481C1C}">
+                          <a14:useLocalDpi xmlns:a14="http://schemas.microsoft.com/office/drawing/2010/main" val="0"/>
+                        </a:ext>
+                      </a:extLst>
+                    </a:blip>
+                    <a:srcRect/>
+                    <a:stretch>
+                      <a:fillRect/>
+                    </a:stretch>
+                  </pic:blipFill>
+                  <pic:spPr bwMode="auto">
+                    <a:xfrm>
+                      <a:off x="0" y="0"/>
+                      <a:ext cx="4011295" cy="370840"/>
+                    </a:xfrm>
+                    <a:prstGeom prst="rect">
+                      <a:avLst/>
+                    </a:prstGeom>
+                    <a:noFill/>
+                    <a:ln>
+                      <a:noFill/>
+                    </a:ln>
+                  </pic:spPr>
+                </pic:pic>
+              </a:graphicData>
+            </a:graphic>
+          </wp:inline>
+        </w:drawing>
+      </w:r>
     </w:p>
     <w:p>
       <w:pPr>
@@ -344,7 +988,7 @@
         </w:numPr>
       </w:pPr>
       <w:r>
-        <w:t>Información de memoria</w:t>
+        <w:t>Estadísticas de red</w:t>
       </w:r>
     </w:p>
     <w:p>
@@ -355,7 +999,7 @@
         </w:numPr>
       </w:pPr>
       <w:r>
-        <w:t>Memoria total</w:t>
+        <w:t>Bytes enviados</w:t>
       </w:r>
     </w:p>
     <w:p>
@@ -366,7 +1010,7 @@
         </w:numPr>
       </w:pPr>
       <w:r>
-        <w:t>Memoria disponible</w:t>
+        <w:t>Bytes recibidos</w:t>
       </w:r>
     </w:p>
     <w:p>
@@ -377,18 +1021,7 @@
         </w:numPr>
       </w:pPr>
       <w:r>
-        <w:t>Porcentaje de memoria usada</w:t>
-      </w:r>
-    </w:p>
-    <w:p>
-      <w:pPr>
-        <w:numPr>
-          <w:ilvl w:val="2"/>
-          <w:numId w:val="1"/>
-        </w:numPr>
-      </w:pPr>
-      <w:r>
-        <w:t>Información de discos</w:t>
+        <w:t>Paquetes enviados</w:t>
       </w:r>
     </w:p>
     <w:p>
@@ -399,123 +1032,7 @@
         </w:numPr>
       </w:pPr>
       <w:r>
-        <w:t>Listado de</w:t>
-      </w:r>
-      <w:r>
-        <w:t xml:space="preserve"> particiones</w:t>
-      </w:r>
-    </w:p>
-    <w:p>
-      <w:pPr>
-        <w:numPr>
-          <w:ilvl w:val="3"/>
-          <w:numId w:val="1"/>
-        </w:numPr>
-      </w:pPr>
-      <w:r>
-        <w:t>Uso de disco para cada unidad o partición</w:t>
-      </w:r>
-    </w:p>
-    <w:p>
-      <w:pPr>
-        <w:numPr>
-          <w:ilvl w:val="3"/>
-          <w:numId w:val="1"/>
-        </w:numPr>
-      </w:pPr>
-      <w:r>
-        <w:t>Número de operaciones de lectura</w:t>
-      </w:r>
-    </w:p>
-    <w:p>
-      <w:pPr>
-        <w:numPr>
-          <w:ilvl w:val="3"/>
-          <w:numId w:val="1"/>
-        </w:numPr>
-      </w:pPr>
-      <w:r>
-        <w:t>Número de operaciones de escritura</w:t>
-      </w:r>
-    </w:p>
-    <w:p>
-      <w:pPr>
-        <w:numPr>
-          <w:ilvl w:val="3"/>
-          <w:numId w:val="1"/>
-        </w:numPr>
-      </w:pPr>
-      <w:r>
-        <w:t>Número de bytes leídos</w:t>
-      </w:r>
-    </w:p>
-    <w:p>
-      <w:pPr>
-        <w:numPr>
-          <w:ilvl w:val="3"/>
-          <w:numId w:val="1"/>
-        </w:numPr>
-      </w:pPr>
-      <w:r>
-        <w:t>Número de bytes escritos</w:t>
-      </w:r>
-    </w:p>
-    <w:p>
-      <w:pPr>
-        <w:numPr>
-          <w:ilvl w:val="2"/>
-          <w:numId w:val="1"/>
-        </w:numPr>
-      </w:pPr>
-      <w:r>
-        <w:t>Estadísticas de red</w:t>
-      </w:r>
-    </w:p>
-    <w:p>
-      <w:pPr>
-        <w:numPr>
-          <w:ilvl w:val="3"/>
-          <w:numId w:val="1"/>
-        </w:numPr>
-      </w:pPr>
-      <w:r>
-        <w:t>Bytes enviados</w:t>
-      </w:r>
-    </w:p>
-    <w:p>
-      <w:pPr>
-        <w:numPr>
-          <w:ilvl w:val="3"/>
-          <w:numId w:val="1"/>
-        </w:numPr>
-      </w:pPr>
-      <w:r>
-        <w:t>Bytes recibidos</w:t>
-      </w:r>
-    </w:p>
-    <w:p>
-      <w:pPr>
-        <w:numPr>
-          <w:ilvl w:val="3"/>
-          <w:numId w:val="1"/>
-        </w:numPr>
-      </w:pPr>
-      <w:r>
-        <w:t>Paquetes enviados</w:t>
-      </w:r>
-    </w:p>
-    <w:p>
-      <w:pPr>
-        <w:numPr>
-          <w:ilvl w:val="3"/>
-          <w:numId w:val="1"/>
-        </w:numPr>
-      </w:pPr>
-      <w:r>
-        <w:t>Paquetes recibid</w:t>
-      </w:r>
-      <w:r>
-        <w:t>os</w:t>
+        <w:t>Paquetes recibidos</w:t>
       </w:r>
     </w:p>
     <w:p>
@@ -560,8 +1077,138 @@
         </w:numPr>
       </w:pPr>
       <w:r>
+        <w:t>Elabora un programa en Python que permita consultar la información de los servicios en Windows. El programa mostrará un menú con dos opciones:</w:t>
+      </w:r>
+    </w:p>
+    <w:p>
+      <w:pPr>
+        <w:numPr>
+          <w:ilvl w:val="1"/>
+          <w:numId w:val="1"/>
+        </w:numPr>
+      </w:pPr>
+      <w:r>
+        <w:t>Mostrar todos los servicios:</w:t>
+      </w:r>
+    </w:p>
+    <w:p>
+      <w:pPr>
+        <w:ind w:left="1440"/>
+      </w:pPr>
+      <w:r>
+        <w:t>Para cada servicio se mostrará su nombre, PID asociado, estado y tipo de inicio</w:t>
+      </w:r>
+    </w:p>
+    <w:p>
+      <w:pPr>
+        <w:numPr>
+          <w:ilvl w:val="1"/>
+          <w:numId w:val="1"/>
+        </w:numPr>
+      </w:pPr>
+      <w:r>
+        <w:t>Mostrar servicios filtrados:</w:t>
+      </w:r>
+    </w:p>
+    <w:p>
+      <w:pPr>
+        <w:ind w:left="1440"/>
+      </w:pPr>
+      <w:r>
+        <w:t>El filtro será una cadena de texto formada por una o dos palabras separadas por un espacio. La primera de ellas hará referencia al estado del servicio: iniciado o parado; y la segunda al tipo de inicio: manual o automático</w:t>
+      </w:r>
+    </w:p>
+    <w:p>
+      <w:pPr>
+        <w:numPr>
+          <w:ilvl w:val="1"/>
+          <w:numId w:val="1"/>
+        </w:numPr>
+      </w:pPr>
+      <w:r>
+        <w:t>Mostrar descripción de un servicio:</w:t>
+      </w:r>
+    </w:p>
+    <w:p>
+      <w:pPr>
+        <w:ind w:left="1440"/>
+      </w:pPr>
+      <w:r>
+        <w:t>Se proporcionará el nombre del servicio y mostrará la descripción del mismo</w:t>
+      </w:r>
+    </w:p>
+    <w:p>
+      <w:pPr>
+        <w:ind w:left="1440"/>
+      </w:pPr>
+    </w:p>
+    <w:p>
+      <w:pPr>
+        <w:numPr>
+          <w:ilvl w:val="0"/>
+          <w:numId w:val="1"/>
+        </w:numPr>
+      </w:pPr>
+      <w:r>
+        <w:t>Elabora un programa en Python que recopile información de los procesos del sistema. El programa deberá mostrar el siguiente menú:</w:t>
+      </w:r>
+    </w:p>
+    <w:p>
+      <w:pPr>
+        <w:numPr>
+          <w:ilvl w:val="1"/>
+          <w:numId w:val="1"/>
+        </w:numPr>
+      </w:pPr>
+      <w:r>
+        <w:t>Mostrar información de todos los procesos:</w:t>
+      </w:r>
+    </w:p>
+    <w:p>
+      <w:pPr>
+        <w:ind w:left="1440"/>
+      </w:pPr>
+      <w:r>
+        <w:t>Se mostrará por defecto PID, nombre y usuario</w:t>
+      </w:r>
+    </w:p>
+    <w:p>
+      <w:pPr>
+        <w:numPr>
+          <w:ilvl w:val="1"/>
+          <w:numId w:val="1"/>
+        </w:numPr>
+      </w:pPr>
+      <w:r>
+        <w:t>Filtrar procesos por uso de memoria:</w:t>
+      </w:r>
+    </w:p>
+    <w:p>
+      <w:pPr>
+        <w:ind w:left="1440"/>
+      </w:pPr>
+      <w:r>
+        <w:t>Se preguntará al usuario un porcentaje de uso de memoria y sólo se mostrarán los procesos que tengan un valor mayor. Los procesos se mostrarán de mayor a menor uso de memoria.</w:t>
+      </w:r>
+    </w:p>
+    <w:p>
+      <w:pPr>
+        <w:numPr>
+          <w:ilvl w:val="1"/>
+          <w:numId w:val="1"/>
+        </w:numPr>
+      </w:pPr>
+      <w:r>
         <w:lastRenderedPageBreak/>
-        <w:t>Elabora un programa en Python que permita consultar la información de los servicios en Windows. El programa mostrará un menú con dos opciones:</w:t>
+        <w:t>Filtrar procesos por uso de CPU:</w:t>
+      </w:r>
+    </w:p>
+    <w:p>
+      <w:pPr>
+        <w:ind w:left="1440"/>
+      </w:pPr>
+      <w:r>
+        <w:t>Se preguntará al usuario un porcentaje de uso de CPU (se realizará un sondeo con intervalo de 0.5) y solo se mostrarán los procesos que tengan un valor mayor. Los procesos se mostrarán de menor a mayor uso de CPU.</w:t>
       </w:r>
     </w:p>
     <w:p>
@@ -572,7 +1219,7 @@
         </w:numPr>
       </w:pPr>
       <w:r>
-        <w:t>Mostrar todos los servicios:</w:t>
+        <w:t>Mostrar árbol de procesos</w:t>
       </w:r>
     </w:p>
     <w:p>
@@ -580,172 +1227,24 @@
         <w:ind w:left="1440"/>
       </w:pPr>
       <w:r>
-        <w:t>Para cada servicio se mostrará su nombre, PID asociado, estado y tipo de inicio</w:t>
-      </w:r>
-    </w:p>
-    <w:p>
-      <w:pPr>
-        <w:numPr>
-          <w:ilvl w:val="1"/>
-          <w:numId w:val="1"/>
-        </w:numPr>
-      </w:pPr>
-      <w:r>
-        <w:t>Most</w:t>
-      </w:r>
-      <w:r>
-        <w:t>rar servicios filtrados:</w:t>
+        <w:t xml:space="preserve">Se preguntará al usuario por un PID, se debe comprobar que el proceso existe, y a continuación se mostrará de manera recursiva el árbol de procesos. De estos procesos solo se mostrará PID y nombre. Gráficamente se representarán los hijos de un proceso imprimiendo estos con dos espacios de </w:t>
+      </w:r>
+      <w:proofErr w:type="spellStart"/>
+      <w:r>
+        <w:t>indentado</w:t>
+      </w:r>
+      <w:proofErr w:type="spellEnd"/>
+      <w:r>
+        <w:t xml:space="preserve"> respecto a su padre.</w:t>
       </w:r>
     </w:p>
     <w:p>
       <w:pPr>
         <w:ind w:left="1440"/>
       </w:pPr>
-      <w:r>
-        <w:t>El filtro será una cadena de texto formada por una o dos palabras separadas por un espacio. La primera de ellas hará referencia al estado del servicio: iniciado o parado; y la segunda al tipo de inicio: manual o automático</w:t>
-      </w:r>
-    </w:p>
-    <w:p>
-      <w:pPr>
-        <w:numPr>
-          <w:ilvl w:val="1"/>
-          <w:numId w:val="1"/>
-        </w:numPr>
-      </w:pPr>
-      <w:r>
-        <w:t xml:space="preserve">Mostrar </w:t>
-      </w:r>
-      <w:r>
-        <w:t>descripción de un servicio:</w:t>
-      </w:r>
-    </w:p>
-    <w:p>
-      <w:pPr>
-        <w:ind w:left="1440"/>
-      </w:pPr>
-      <w:r>
-        <w:t>Se proporcionará el nombre del servicio y mostrará la descripción del mismo</w:t>
-      </w:r>
-    </w:p>
-    <w:p>
-      <w:pPr>
-        <w:ind w:left="1440"/>
-      </w:pPr>
-    </w:p>
-    <w:p>
-      <w:pPr>
-        <w:numPr>
-          <w:ilvl w:val="0"/>
-          <w:numId w:val="1"/>
-        </w:numPr>
-      </w:pPr>
-      <w:r>
-        <w:t>Elabora un programa en Python que recopile información de los procesos del sistema. El programa deberá mostrar el siguiente menú:</w:t>
-      </w:r>
-    </w:p>
-    <w:p>
-      <w:pPr>
-        <w:numPr>
-          <w:ilvl w:val="1"/>
-          <w:numId w:val="1"/>
-        </w:numPr>
-      </w:pPr>
-      <w:r>
-        <w:t>Mostrar información d</w:t>
-      </w:r>
-      <w:r>
-        <w:t>e todos los procesos:</w:t>
-      </w:r>
-    </w:p>
-    <w:p>
-      <w:pPr>
-        <w:ind w:left="1440"/>
-      </w:pPr>
-      <w:r>
-        <w:t>Se mostrará por defecto PID, nombre y usuario</w:t>
-      </w:r>
-    </w:p>
-    <w:p>
-      <w:pPr>
-        <w:numPr>
-          <w:ilvl w:val="1"/>
-          <w:numId w:val="1"/>
-        </w:numPr>
-      </w:pPr>
-      <w:r>
-        <w:t>Filtrar procesos por uso de memoria:</w:t>
-      </w:r>
-    </w:p>
-    <w:p>
-      <w:pPr>
-        <w:ind w:left="1440"/>
-      </w:pPr>
-      <w:r>
-        <w:t>Se preguntará al usuario un porcentaje de uso de memoria y sólo se mostrarán los procesos que tengan un valor mayor. Los procesos se mostrarán de mayor</w:t>
-      </w:r>
-      <w:r>
-        <w:t xml:space="preserve"> a menor uso de memoria.</w:t>
-      </w:r>
-    </w:p>
-    <w:p>
-      <w:pPr>
-        <w:numPr>
-          <w:ilvl w:val="1"/>
-          <w:numId w:val="1"/>
-        </w:numPr>
-      </w:pPr>
-      <w:r>
-        <w:t>Filtrar procesos por uso de CPU:</w:t>
-      </w:r>
-    </w:p>
-    <w:p>
-      <w:pPr>
-        <w:ind w:left="1440"/>
-      </w:pPr>
-      <w:r>
-        <w:t>Se preguntará al usuario un porcentaje de uso de CPU (se realizará un sondeo con intervalo de 0.5) y solo se mostrarán los procesos que tengan un valor mayor. Los procesos se mostrarán de menor a ma</w:t>
-      </w:r>
-      <w:r>
-        <w:t>yor uso de CPU.</w:t>
-      </w:r>
-    </w:p>
-    <w:p>
-      <w:pPr>
-        <w:numPr>
-          <w:ilvl w:val="1"/>
-          <w:numId w:val="1"/>
-        </w:numPr>
-      </w:pPr>
-      <w:r>
-        <w:t>Mostrar árbol de procesos</w:t>
-      </w:r>
-    </w:p>
-    <w:p>
-      <w:pPr>
-        <w:ind w:left="1440"/>
-      </w:pPr>
-      <w:r>
-        <w:t xml:space="preserve">Se preguntará al usuario por un PID, se debe comprobar que el proceso existe, y a continuación se mostrará de manera recursiva el árbol de procesos. De estos procesos solo se mostrará PID y nombre. Gráficamente se </w:t>
-      </w:r>
-      <w:r>
-        <w:t xml:space="preserve">representarán los hijos de un proceso imprimiendo estos con dos espacios de </w:t>
-      </w:r>
-      <w:proofErr w:type="spellStart"/>
-      <w:r>
-        <w:t>indentado</w:t>
-      </w:r>
-      <w:proofErr w:type="spellEnd"/>
-      <w:r>
-        <w:t xml:space="preserve"> respecto a su padre.</w:t>
-      </w:r>
-    </w:p>
-    <w:p>
-      <w:pPr>
-        <w:ind w:left="1440"/>
-      </w:pPr>
     </w:p>
     <w:sectPr>
-      <w:headerReference w:type="default" r:id="rId11"/>
+      <w:headerReference w:type="default" r:id="rId20"/>
       <w:pgSz w:w="11909" w:h="16834"/>
       <w:pgMar w:top="1440" w:right="1440" w:bottom="1440" w:left="1440" w:header="720" w:footer="720" w:gutter="0"/>
       <w:pgNumType w:start="1"/>

</xml_diff>